<commit_message>
gestion de errores en word
</commit_message>
<xml_diff>
--- a/PDF Entregable TPI.docx
+++ b/PDF Entregable TPI.docx
@@ -1,6 +1,6 @@
 
 <file path=word/document.xml><?xml version="1.0" encoding="utf-8"?>
-<w:document xmlns:wpc="http://schemas.microsoft.com/office/word/2010/wordprocessingCanvas" xmlns:cx="http://schemas.microsoft.com/office/drawing/2014/chartex" xmlns:cx1="http://schemas.microsoft.com/office/drawing/2015/9/8/chartex" xmlns:cx2="http://schemas.microsoft.com/office/drawing/2015/10/21/chartex" xmlns:cx3="http://schemas.microsoft.com/office/drawing/2016/5/9/chartex" xmlns:cx4="http://schemas.microsoft.com/office/drawing/2016/5/10/chartex" xmlns:cx5="http://schemas.microsoft.com/office/drawing/2016/5/11/chartex" xmlns:cx6="http://schemas.microsoft.com/office/drawing/2016/5/12/chartex" xmlns:cx7="http://schemas.microsoft.com/office/drawing/2016/5/13/chartex" xmlns:cx8="http://schemas.microsoft.com/office/drawing/2016/5/14/chartex" xmlns:mc="http://schemas.openxmlformats.org/markup-compatibility/2006" xmlns:aink="http://schemas.microsoft.com/office/drawing/2016/ink" xmlns:am3d="http://schemas.microsoft.com/office/drawing/2017/model3d" xmlns:o="urn:schemas-microsoft-com:office:office" xmlns:r="http://schemas.openxmlformats.org/officeDocument/2006/relationships" xmlns:m="http://schemas.openxmlformats.org/officeDocument/2006/math" xmlns:v="urn:schemas-microsoft-com:vml" xmlns:wp14="http://schemas.microsoft.com/office/word/2010/wordprocessingDrawing" xmlns:wp="http://schemas.openxmlformats.org/drawingml/2006/wordprocessingDrawing" xmlns:w10="urn:schemas-microsoft-com:office:word" xmlns:w="http://schemas.openxmlformats.org/wordprocessingml/2006/main" xmlns:w14="http://schemas.microsoft.com/office/word/2010/wordml" xmlns:w15="http://schemas.microsoft.com/office/word/2012/wordml" xmlns:w16cex="http://schemas.microsoft.com/office/word/2018/wordml/cex" xmlns:w16cid="http://schemas.microsoft.com/office/word/2016/wordml/cid" xmlns:w16="http://schemas.microsoft.com/office/word/2018/wordml" xmlns:w16sdtdh="http://schemas.microsoft.com/office/word/2020/wordml/sdtdatahash" xmlns:w16se="http://schemas.microsoft.com/office/word/2015/wordml/symex" xmlns:wpg="http://schemas.microsoft.com/office/word/2010/wordprocessingGroup" xmlns:wpi="http://schemas.microsoft.com/office/word/2010/wordprocessingInk" xmlns:wne="http://schemas.microsoft.com/office/word/2006/wordml" xmlns:wps="http://schemas.microsoft.com/office/word/2010/wordprocessingShape" mc:Ignorable="w14 w15 w16se w16cid w16 w16cex w16sdtdh wp14">
+<w:document xmlns:wpc="http://schemas.microsoft.com/office/word/2010/wordprocessingCanvas" xmlns:cx="http://schemas.microsoft.com/office/drawing/2014/chartex" xmlns:cx1="http://schemas.microsoft.com/office/drawing/2015/9/8/chartex" xmlns:cx2="http://schemas.microsoft.com/office/drawing/2015/10/21/chartex" xmlns:cx3="http://schemas.microsoft.com/office/drawing/2016/5/9/chartex" xmlns:cx4="http://schemas.microsoft.com/office/drawing/2016/5/10/chartex" xmlns:cx5="http://schemas.microsoft.com/office/drawing/2016/5/11/chartex" xmlns:cx6="http://schemas.microsoft.com/office/drawing/2016/5/12/chartex" xmlns:cx7="http://schemas.microsoft.com/office/drawing/2016/5/13/chartex" xmlns:cx8="http://schemas.microsoft.com/office/drawing/2016/5/14/chartex" xmlns:mc="http://schemas.openxmlformats.org/markup-compatibility/2006" xmlns:aink="http://schemas.microsoft.com/office/drawing/2016/ink" xmlns:am3d="http://schemas.microsoft.com/office/drawing/2017/model3d" xmlns:o="urn:schemas-microsoft-com:office:office" xmlns:oel="http://schemas.microsoft.com/office/2019/extlst" xmlns:r="http://schemas.openxmlformats.org/officeDocument/2006/relationships" xmlns:m="http://schemas.openxmlformats.org/officeDocument/2006/math" xmlns:v="urn:schemas-microsoft-com:vml" xmlns:wp14="http://schemas.microsoft.com/office/word/2010/wordprocessingDrawing" xmlns:wp="http://schemas.openxmlformats.org/drawingml/2006/wordprocessingDrawing" xmlns:w10="urn:schemas-microsoft-com:office:word" xmlns:w="http://schemas.openxmlformats.org/wordprocessingml/2006/main" xmlns:w14="http://schemas.microsoft.com/office/word/2010/wordml" xmlns:w15="http://schemas.microsoft.com/office/word/2012/wordml" xmlns:w16cex="http://schemas.microsoft.com/office/word/2018/wordml/cex" xmlns:w16cid="http://schemas.microsoft.com/office/word/2016/wordml/cid" xmlns:w16="http://schemas.microsoft.com/office/word/2018/wordml" xmlns:w16du="http://schemas.microsoft.com/office/word/2023/wordml/word16du" xmlns:w16sdtdh="http://schemas.microsoft.com/office/word/2020/wordml/sdtdatahash" xmlns:w16sdtfl="http://schemas.microsoft.com/office/word/2024/wordml/sdtformatlock" xmlns:w16se="http://schemas.microsoft.com/office/word/2015/wordml/symex" xmlns:wpg="http://schemas.microsoft.com/office/word/2010/wordprocessingGroup" xmlns:wpi="http://schemas.microsoft.com/office/word/2010/wordprocessingInk" xmlns:wne="http://schemas.microsoft.com/office/word/2006/wordml" xmlns:wps="http://schemas.microsoft.com/office/word/2010/wordprocessingShape" mc:Ignorable="w14 w15 w16se w16cid w16 w16cex w16sdtdh w16sdtfl w16du wp14">
   <w:body>
     <w:p>
       <w:pPr>
@@ -149,16 +149,7 @@
           <w:sz w:val="32"/>
           <w:szCs w:val="32"/>
         </w:rPr>
-        <w:t>Gestión de Datos de Países en Python: filtros, ordenamientos y estadísticas</w:t>
-      </w:r>
-      <w:r>
-        <w:rPr>
-          <w:b/>
-          <w:bCs/>
-          <w:sz w:val="32"/>
-          <w:szCs w:val="32"/>
-        </w:rPr>
-        <w:t>.</w:t>
+        <w:t>Gestión de Datos de Países en Python: filtros, ordenamientos y estadísticas.</w:t>
       </w:r>
     </w:p>
     <w:p>
@@ -256,7 +247,7 @@
           <w:sz w:val="28"/>
           <w:szCs w:val="28"/>
         </w:rPr>
-        <w:t xml:space="preserve">Monti </w:t>
+        <w:t>Monti</w:t>
       </w:r>
       <w:r>
         <w:rPr>
@@ -265,7 +256,34 @@
           <w:sz w:val="28"/>
           <w:szCs w:val="28"/>
         </w:rPr>
+        <w:t>vero</w:t>
+      </w:r>
+      <w:r>
+        <w:rPr>
+          <w:b/>
+          <w:bCs/>
+          <w:sz w:val="28"/>
+          <w:szCs w:val="28"/>
+        </w:rPr>
+        <w:t xml:space="preserve"> </w:t>
+      </w:r>
+      <w:r>
+        <w:rPr>
+          <w:b/>
+          <w:bCs/>
+          <w:sz w:val="28"/>
+          <w:szCs w:val="28"/>
+        </w:rPr>
         <w:t xml:space="preserve">Aaron </w:t>
+      </w:r>
+      <w:r>
+        <w:rPr>
+          <w:b/>
+          <w:bCs/>
+          <w:sz w:val="28"/>
+          <w:szCs w:val="28"/>
+        </w:rPr>
+        <w:t>Luciano</w:t>
       </w:r>
     </w:p>
     <w:p>
@@ -537,14 +555,7 @@
           <w:sz w:val="24"/>
           <w:szCs w:val="24"/>
         </w:rPr>
-        <w:t>-----------------------------------------------------------------------</w:t>
-      </w:r>
-      <w:r>
-        <w:rPr>
-          <w:sz w:val="24"/>
-          <w:szCs w:val="24"/>
-        </w:rPr>
-        <w:t>- Pag 3</w:t>
+        <w:t>------------------------------------------------------------------------ Pag 3</w:t>
       </w:r>
     </w:p>
     <w:p>
@@ -566,21 +577,7 @@
           <w:sz w:val="24"/>
           <w:szCs w:val="24"/>
         </w:rPr>
-        <w:t>---------------------------------</w:t>
-      </w:r>
-      <w:r>
-        <w:rPr>
-          <w:sz w:val="24"/>
-          <w:szCs w:val="24"/>
-        </w:rPr>
-        <w:t>------------------------------------------</w:t>
-      </w:r>
-      <w:r>
-        <w:rPr>
-          <w:sz w:val="24"/>
-          <w:szCs w:val="24"/>
-        </w:rPr>
-        <w:t xml:space="preserve"> Pag 4</w:t>
+        <w:t>--------------------------------------------------------------------------- Pag 4</w:t>
       </w:r>
     </w:p>
     <w:p>
@@ -602,14 +599,7 @@
           <w:sz w:val="24"/>
           <w:szCs w:val="24"/>
         </w:rPr>
-        <w:t>-----------------------------------------------------------------------</w:t>
-      </w:r>
-      <w:r>
-        <w:rPr>
-          <w:sz w:val="24"/>
-          <w:szCs w:val="24"/>
-        </w:rPr>
-        <w:t>-------------------Pag 5</w:t>
+        <w:t>------------------------------------------------------------------------------------------Pag 5</w:t>
       </w:r>
     </w:p>
     <w:p>
@@ -631,14 +621,7 @@
           <w:sz w:val="24"/>
           <w:szCs w:val="24"/>
         </w:rPr>
-        <w:t>-----------------------------------------------------------------------</w:t>
-      </w:r>
-      <w:r>
-        <w:rPr>
-          <w:sz w:val="24"/>
-          <w:szCs w:val="24"/>
-        </w:rPr>
-        <w:t>----------------Pag 6</w:t>
+        <w:t>---------------------------------------------------------------------------------------Pag 6</w:t>
       </w:r>
     </w:p>
     <w:p>
@@ -660,14 +643,7 @@
           <w:sz w:val="24"/>
           <w:szCs w:val="24"/>
         </w:rPr>
-        <w:t>-----------------------------------------------------------------------</w:t>
-      </w:r>
-      <w:r>
-        <w:rPr>
-          <w:sz w:val="24"/>
-          <w:szCs w:val="24"/>
-        </w:rPr>
-        <w:t>--------</w:t>
+        <w:t>-------------------------------------------------------------------------------</w:t>
       </w:r>
       <w:r>
         <w:rPr>
@@ -919,14 +895,7 @@
           <w:rFonts w:cstheme="minorHAnsi"/>
           <w:shd w:val="clear" w:color="auto" w:fill="FFFFFF"/>
         </w:rPr>
-        <w:t>ya que</w:t>
-      </w:r>
-      <w:r>
-        <w:rPr>
-          <w:rFonts w:cstheme="minorHAnsi"/>
-          <w:shd w:val="clear" w:color="auto" w:fill="FFFFFF"/>
-        </w:rPr>
-        <w:t xml:space="preserve"> un lenguaje inadecuado puede condenar un proyecto al fracaso desde el principio</w:t>
+        <w:t>ya que un lenguaje inadecuado puede condenar un proyecto al fracaso desde el principio</w:t>
       </w:r>
       <w:r>
         <w:rPr>
@@ -1159,10 +1128,7 @@
         <w:ind w:left="1416" w:firstLine="708"/>
       </w:pPr>
       <w:r>
-        <w:t xml:space="preserve">Ejemplo: </w:t>
-      </w:r>
-      <w:r>
-        <w:t>{</w:t>
+        <w:t>Ejemplo: {</w:t>
       </w:r>
     </w:p>
     <w:p>
@@ -1432,13 +1398,7 @@
         <w:jc w:val="both"/>
       </w:pPr>
       <w:r>
-        <w:t xml:space="preserve">Para el desarrollo de este proyecto, se optó por una arquitectura basada en las herramientas </w:t>
-      </w:r>
-      <w:r>
-        <w:t>integradas</w:t>
-      </w:r>
-      <w:r>
-        <w:t xml:space="preserve"> de Python, priorizando la eficiencia en la manipulación de los datos y la modularidad del código</w:t>
+        <w:t>Para el desarrollo de este proyecto, se optó por una arquitectura basada en las herramientas integradas de Python, priorizando la eficiencia en la manipulación de los datos y la modularidad del código</w:t>
       </w:r>
     </w:p>
     <w:p>
@@ -1446,13 +1406,7 @@
         <w:jc w:val="both"/>
       </w:pPr>
       <w:r>
-        <w:t xml:space="preserve">El almacenamiento principal de la información se </w:t>
-      </w:r>
-      <w:r>
-        <w:t>llevó a cabo</w:t>
-      </w:r>
-      <w:r>
-        <w:t xml:space="preserve"> mediante </w:t>
+        <w:t xml:space="preserve">El almacenamiento principal de la información se llevó a cabo mediante </w:t>
       </w:r>
       <w:r>
         <w:t>listas</w:t>
@@ -1470,28 +1424,13 @@
         <w:t>diccionarios</w:t>
       </w:r>
       <w:r>
-        <w:t xml:space="preserve">. </w:t>
-      </w:r>
-      <w:r>
-        <w:t xml:space="preserve">A través de la </w:t>
-      </w:r>
-      <w:r>
-        <w:t xml:space="preserve">estructura de clave-valor </w:t>
-      </w:r>
-      <w:r>
-        <w:t xml:space="preserve">se </w:t>
-      </w:r>
-      <w:r>
-        <w:t>modela</w:t>
+        <w:t>. A través de la estructura de clave-valor se modela</w:t>
       </w:r>
       <w:r>
         <w:t>ron</w:t>
       </w:r>
       <w:r>
-        <w:t xml:space="preserve"> los atributos específicos de cada nación, tales como su nombre, población, superficie y continente, facilitando un acceso rápido y </w:t>
-      </w:r>
-      <w:r>
-        <w:t>ordenado.</w:t>
+        <w:t xml:space="preserve"> los atributos específicos de cada nación, tales como su nombre, población, superficie y continente, facilitando un acceso rápido y ordenado.</w:t>
       </w:r>
     </w:p>
     <w:p>
@@ -1511,25 +1450,7 @@
         <w:t>CSV</w:t>
       </w:r>
       <w:r>
-        <w:t>. Est</w:t>
-      </w:r>
-      <w:r>
-        <w:t xml:space="preserve">o </w:t>
-      </w:r>
-      <w:r>
-        <w:t xml:space="preserve">asegura un manejo de datos </w:t>
-      </w:r>
-      <w:r>
-        <w:t xml:space="preserve">en forma de tabla, </w:t>
-      </w:r>
-      <w:r>
-        <w:t>sencill</w:t>
-      </w:r>
-      <w:r>
-        <w:t>a</w:t>
-      </w:r>
-      <w:r>
-        <w:t xml:space="preserve"> y compatible, permitiendo que la información se conserve entre las distintas ejecuciones del programa.</w:t>
+        <w:t>. Esto asegura un manejo de datos en forma de tabla, sencilla y compatible, permitiendo que la información se conserve entre las distintas ejecuciones del programa.</w:t>
       </w:r>
     </w:p>
     <w:p>
@@ -1565,19 +1486,7 @@
         <w:jc w:val="both"/>
       </w:pPr>
       <w:r>
-        <w:t>El análisis de los datos se apoy</w:t>
-      </w:r>
-      <w:r>
-        <w:t>ó</w:t>
-      </w:r>
-      <w:r>
-        <w:t xml:space="preserve"> en herramientas nativas del lenguaje. Por un lado, se recurr</w:t>
-      </w:r>
-      <w:r>
-        <w:t>ió</w:t>
-      </w:r>
-      <w:r>
-        <w:t xml:space="preserve"> a la </w:t>
+        <w:t xml:space="preserve">El análisis de los datos se apoyó en herramientas nativas del lenguaje. Por un lado, se recurrió a la </w:t>
       </w:r>
       <w:r>
         <w:rPr>
@@ -1598,19 +1507,7 @@
         <w:rPr>
           <w:rFonts w:cstheme="minorHAnsi"/>
         </w:rPr>
-        <w:t xml:space="preserve"> para el ordenamiento dinámico de los países bajo diferentes criterios (superficie, población o denominación). Por el otro, se integra</w:t>
-      </w:r>
-      <w:r>
-        <w:rPr>
-          <w:rFonts w:cstheme="minorHAnsi"/>
-        </w:rPr>
-        <w:t>ro</w:t>
-      </w:r>
-      <w:r>
-        <w:rPr>
-          <w:rFonts w:cstheme="minorHAnsi"/>
-        </w:rPr>
-        <w:t xml:space="preserve">n funciones como </w:t>
+        <w:t xml:space="preserve"> para el ordenamiento dinámico de los países bajo diferentes criterios (superficie, población o denominación). Por el otro, se integraron funciones como </w:t>
       </w:r>
       <w:r>
         <w:rPr>
@@ -1655,19 +1552,7 @@
         <w:rPr>
           <w:rFonts w:cstheme="minorHAnsi"/>
         </w:rPr>
-        <w:t>, optimizand</w:t>
-      </w:r>
-      <w:r>
-        <w:rPr>
-          <w:rFonts w:cstheme="minorHAnsi"/>
-        </w:rPr>
-        <w:t>o</w:t>
-      </w:r>
-      <w:r>
-        <w:rPr>
-          <w:rFonts w:cstheme="minorHAnsi"/>
-        </w:rPr>
-        <w:t xml:space="preserve"> el cálculo de métricas estadísticas clave como los extremos demográficos</w:t>
+        <w:t>, optimizando el cálculo de métricas estadísticas clave como los extremos demográficos</w:t>
       </w:r>
       <w:r>
         <w:t xml:space="preserve"> y la media poblacional.</w:t>
@@ -1791,17 +1676,76 @@
       </w:r>
     </w:p>
     <w:p>
+      <w:r>
+        <w:t>Para garantizar la robustez de la aplicación y evitar interrupciones durante la ejecución, se implement</w:t>
+      </w:r>
+      <w:r>
+        <w:t>aron</w:t>
+      </w:r>
+      <w:r>
+        <w:t xml:space="preserve"> try-except y bucles de validación continua (while True).</w:t>
+      </w:r>
+    </w:p>
+    <w:p>
+      <w:pPr>
+        <w:numPr>
+          <w:ilvl w:val="0"/>
+          <w:numId w:val="5"/>
+        </w:numPr>
+      </w:pPr>
+      <w:r>
+        <w:rPr>
+          <w:b/>
+          <w:bCs/>
+        </w:rPr>
+        <w:t>Validación de tipos de datos:</w:t>
+      </w:r>
+      <w:r>
+        <w:t xml:space="preserve"> Se capturaron excepciones del tipo ValueError al parsear strings a enteros, asegurando que el programa no falle si el usuario ingresa caracteres alfabéticos en campos numéricos (como población o superficie).</w:t>
+      </w:r>
+    </w:p>
+    <w:p>
+      <w:pPr>
+        <w:numPr>
+          <w:ilvl w:val="0"/>
+          <w:numId w:val="5"/>
+        </w:numPr>
+      </w:pPr>
+      <w:r>
+        <w:rPr>
+          <w:b/>
+          <w:bCs/>
+        </w:rPr>
+        <w:t>Validación de lógica de negocio:</w:t>
+      </w:r>
+      <w:r>
+        <w:t xml:space="preserve"> Se incorporaron controles para impedir el ingreso de valores negativos y estructuras condicionales para verificar que, al solicitar rangos estadísticos, el valor mínimo no supere al máximo.</w:t>
+      </w:r>
+    </w:p>
+    <w:p>
+      <w:pPr>
+        <w:numPr>
+          <w:ilvl w:val="0"/>
+          <w:numId w:val="5"/>
+        </w:numPr>
+      </w:pPr>
+      <w:r>
+        <w:rPr>
+          <w:b/>
+          <w:bCs/>
+        </w:rPr>
+        <w:t>Persistencia de la interfaz:</w:t>
+      </w:r>
+      <w:r>
+        <w:t xml:space="preserve"> En lugar de terminar el programa ante un error, el sistema notifica el fallo mediante una función centralizada de feedback (imprimir_error) y solicita el reingreso del dato de forma iterativa, garantizando una experiencia de usuario fluida y libre de frustraciones.</w:t>
+      </w:r>
+    </w:p>
+    <w:p>
       <w:pPr>
         <w:rPr>
           <w:highlight w:val="yellow"/>
         </w:rPr>
       </w:pPr>
-      <w:r>
-        <w:rPr>
-          <w:highlight w:val="yellow"/>
-        </w:rPr>
-        <w:t>ACA IRIA LO DE TRY EXCEPT</w:t>
-      </w:r>
     </w:p>
     <w:p>
       <w:pPr>
@@ -1820,6 +1764,7 @@
           <w:b/>
           <w:bCs/>
         </w:rPr>
+        <w:lastRenderedPageBreak/>
         <w:t>Comunicación del grupo</w:t>
       </w:r>
     </w:p>
@@ -1899,7 +1844,6 @@
           <w:b/>
           <w:bCs/>
         </w:rPr>
-        <w:lastRenderedPageBreak/>
         <w:t>Conclusi</w:t>
       </w:r>
       <w:r>
@@ -2188,6 +2132,7 @@
         <w:rPr>
           <w:b/>
           <w:bCs/>
+          <w:lang w:val="en-US"/>
         </w:rPr>
       </w:pPr>
       <w:r>
@@ -2197,16 +2142,21 @@
         <w:rPr>
           <w:i/>
           <w:iCs/>
+          <w:lang w:val="en-US"/>
         </w:rPr>
         <w:t>Choosing the Right Programming Language</w:t>
       </w:r>
       <w:r>
+        <w:rPr>
+          <w:lang w:val="en-US"/>
+        </w:rPr>
         <w:t xml:space="preserve">. DevOps.com. </w:t>
       </w:r>
       <w:hyperlink r:id="rId8" w:tgtFrame="_blank" w:history="1">
         <w:r>
           <w:rPr>
             <w:rStyle w:val="Hipervnculo"/>
+            <w:lang w:val="en-US"/>
           </w:rPr>
           <w:t>https://devops.com/choosing-the-right-programming-language/</w:t>
         </w:r>
@@ -2225,17 +2175,27 @@
         </w:rPr>
       </w:pPr>
       <w:r>
+        <w:rPr>
+          <w:lang w:val="en-US"/>
+        </w:rPr>
         <w:t xml:space="preserve">Python Software Foundation. (2026). </w:t>
       </w:r>
       <w:r>
         <w:rPr>
           <w:i/>
           <w:iCs/>
+          <w:lang w:val="en-US"/>
         </w:rPr>
         <w:t>Sorting Techniques: The Timsort algorithm</w:t>
       </w:r>
       <w:r>
-        <w:t xml:space="preserve">. Python Standard Library Documentation. </w:t>
+        <w:rPr>
+          <w:lang w:val="en-US"/>
+        </w:rPr>
+        <w:t xml:space="preserve">. </w:t>
+      </w:r>
+      <w:r>
+        <w:t xml:space="preserve">Python Standard Library Documentation. </w:t>
       </w:r>
       <w:hyperlink r:id="rId9" w:tgtFrame="_blank" w:history="1">
         <w:r>
@@ -2259,17 +2219,27 @@
         </w:rPr>
       </w:pPr>
       <w:r>
+        <w:rPr>
+          <w:lang w:val="en-US"/>
+        </w:rPr>
         <w:t xml:space="preserve">Lutz, M. (2013). </w:t>
       </w:r>
       <w:r>
         <w:rPr>
           <w:i/>
           <w:iCs/>
+          <w:lang w:val="en-US"/>
         </w:rPr>
         <w:t>Learning Python</w:t>
       </w:r>
       <w:r>
-        <w:t xml:space="preserve"> (5th ed.). O'Reilly Media.</w:t>
+        <w:rPr>
+          <w:lang w:val="en-US"/>
+        </w:rPr>
+        <w:t xml:space="preserve"> (5th ed.). </w:t>
+      </w:r>
+      <w:r>
+        <w:t>O'Reilly Media.</w:t>
       </w:r>
     </w:p>
     <w:sectPr>
@@ -2284,7 +2254,7 @@
 </file>
 
 <file path=word/endnotes.xml><?xml version="1.0" encoding="utf-8"?>
-<w:endnotes xmlns:wpc="http://schemas.microsoft.com/office/word/2010/wordprocessingCanvas" xmlns:cx="http://schemas.microsoft.com/office/drawing/2014/chartex" xmlns:cx1="http://schemas.microsoft.com/office/drawing/2015/9/8/chartex" xmlns:cx2="http://schemas.microsoft.com/office/drawing/2015/10/21/chartex" xmlns:cx3="http://schemas.microsoft.com/office/drawing/2016/5/9/chartex" xmlns:cx4="http://schemas.microsoft.com/office/drawing/2016/5/10/chartex" xmlns:cx5="http://schemas.microsoft.com/office/drawing/2016/5/11/chartex" xmlns:cx6="http://schemas.microsoft.com/office/drawing/2016/5/12/chartex" xmlns:cx7="http://schemas.microsoft.com/office/drawing/2016/5/13/chartex" xmlns:cx8="http://schemas.microsoft.com/office/drawing/2016/5/14/chartex" xmlns:mc="http://schemas.openxmlformats.org/markup-compatibility/2006" xmlns:aink="http://schemas.microsoft.com/office/drawing/2016/ink" xmlns:am3d="http://schemas.microsoft.com/office/drawing/2017/model3d" xmlns:o="urn:schemas-microsoft-com:office:office" xmlns:r="http://schemas.openxmlformats.org/officeDocument/2006/relationships" xmlns:m="http://schemas.openxmlformats.org/officeDocument/2006/math" xmlns:v="urn:schemas-microsoft-com:vml" xmlns:wp14="http://schemas.microsoft.com/office/word/2010/wordprocessingDrawing" xmlns:wp="http://schemas.openxmlformats.org/drawingml/2006/wordprocessingDrawing" xmlns:w10="urn:schemas-microsoft-com:office:word" xmlns:w="http://schemas.openxmlformats.org/wordprocessingml/2006/main" xmlns:w14="http://schemas.microsoft.com/office/word/2010/wordml" xmlns:w15="http://schemas.microsoft.com/office/word/2012/wordml" xmlns:w16cex="http://schemas.microsoft.com/office/word/2018/wordml/cex" xmlns:w16cid="http://schemas.microsoft.com/office/word/2016/wordml/cid" xmlns:w16="http://schemas.microsoft.com/office/word/2018/wordml" xmlns:w16sdtdh="http://schemas.microsoft.com/office/word/2020/wordml/sdtdatahash" xmlns:w16se="http://schemas.microsoft.com/office/word/2015/wordml/symex" xmlns:wpg="http://schemas.microsoft.com/office/word/2010/wordprocessingGroup" xmlns:wpi="http://schemas.microsoft.com/office/word/2010/wordprocessingInk" xmlns:wne="http://schemas.microsoft.com/office/word/2006/wordml" xmlns:wps="http://schemas.microsoft.com/office/word/2010/wordprocessingShape" mc:Ignorable="w14 w15 w16se w16cid w16 w16cex w16sdtdh wp14">
+<w:endnotes xmlns:wpc="http://schemas.microsoft.com/office/word/2010/wordprocessingCanvas" xmlns:cx="http://schemas.microsoft.com/office/drawing/2014/chartex" xmlns:cx1="http://schemas.microsoft.com/office/drawing/2015/9/8/chartex" xmlns:cx2="http://schemas.microsoft.com/office/drawing/2015/10/21/chartex" xmlns:cx3="http://schemas.microsoft.com/office/drawing/2016/5/9/chartex" xmlns:cx4="http://schemas.microsoft.com/office/drawing/2016/5/10/chartex" xmlns:cx5="http://schemas.microsoft.com/office/drawing/2016/5/11/chartex" xmlns:cx6="http://schemas.microsoft.com/office/drawing/2016/5/12/chartex" xmlns:cx7="http://schemas.microsoft.com/office/drawing/2016/5/13/chartex" xmlns:cx8="http://schemas.microsoft.com/office/drawing/2016/5/14/chartex" xmlns:mc="http://schemas.openxmlformats.org/markup-compatibility/2006" xmlns:aink="http://schemas.microsoft.com/office/drawing/2016/ink" xmlns:am3d="http://schemas.microsoft.com/office/drawing/2017/model3d" xmlns:o="urn:schemas-microsoft-com:office:office" xmlns:oel="http://schemas.microsoft.com/office/2019/extlst" xmlns:r="http://schemas.openxmlformats.org/officeDocument/2006/relationships" xmlns:m="http://schemas.openxmlformats.org/officeDocument/2006/math" xmlns:v="urn:schemas-microsoft-com:vml" xmlns:wp14="http://schemas.microsoft.com/office/word/2010/wordprocessingDrawing" xmlns:wp="http://schemas.openxmlformats.org/drawingml/2006/wordprocessingDrawing" xmlns:w10="urn:schemas-microsoft-com:office:word" xmlns:w="http://schemas.openxmlformats.org/wordprocessingml/2006/main" xmlns:w14="http://schemas.microsoft.com/office/word/2010/wordml" xmlns:w15="http://schemas.microsoft.com/office/word/2012/wordml" xmlns:w16cex="http://schemas.microsoft.com/office/word/2018/wordml/cex" xmlns:w16cid="http://schemas.microsoft.com/office/word/2016/wordml/cid" xmlns:w16="http://schemas.microsoft.com/office/word/2018/wordml" xmlns:w16du="http://schemas.microsoft.com/office/word/2023/wordml/word16du" xmlns:w16sdtdh="http://schemas.microsoft.com/office/word/2020/wordml/sdtdatahash" xmlns:w16sdtfl="http://schemas.microsoft.com/office/word/2024/wordml/sdtformatlock" xmlns:w16se="http://schemas.microsoft.com/office/word/2015/wordml/symex" xmlns:wpg="http://schemas.microsoft.com/office/word/2010/wordprocessingGroup" xmlns:wpi="http://schemas.microsoft.com/office/word/2010/wordprocessingInk" xmlns:wne="http://schemas.microsoft.com/office/word/2006/wordml" xmlns:wps="http://schemas.microsoft.com/office/word/2010/wordprocessingShape" mc:Ignorable="w14 w15 w16se w16cid w16 w16cex w16sdtdh w16sdtfl w16du wp14">
   <w:endnote w:type="separator" w:id="-1">
     <w:p>
       <w:pPr>
@@ -2309,7 +2279,7 @@
 </file>
 
 <file path=word/footnotes.xml><?xml version="1.0" encoding="utf-8"?>
-<w:footnotes xmlns:wpc="http://schemas.microsoft.com/office/word/2010/wordprocessingCanvas" xmlns:cx="http://schemas.microsoft.com/office/drawing/2014/chartex" xmlns:cx1="http://schemas.microsoft.com/office/drawing/2015/9/8/chartex" xmlns:cx2="http://schemas.microsoft.com/office/drawing/2015/10/21/chartex" xmlns:cx3="http://schemas.microsoft.com/office/drawing/2016/5/9/chartex" xmlns:cx4="http://schemas.microsoft.com/office/drawing/2016/5/10/chartex" xmlns:cx5="http://schemas.microsoft.com/office/drawing/2016/5/11/chartex" xmlns:cx6="http://schemas.microsoft.com/office/drawing/2016/5/12/chartex" xmlns:cx7="http://schemas.microsoft.com/office/drawing/2016/5/13/chartex" xmlns:cx8="http://schemas.microsoft.com/office/drawing/2016/5/14/chartex" xmlns:mc="http://schemas.openxmlformats.org/markup-compatibility/2006" xmlns:aink="http://schemas.microsoft.com/office/drawing/2016/ink" xmlns:am3d="http://schemas.microsoft.com/office/drawing/2017/model3d" xmlns:o="urn:schemas-microsoft-com:office:office" xmlns:r="http://schemas.openxmlformats.org/officeDocument/2006/relationships" xmlns:m="http://schemas.openxmlformats.org/officeDocument/2006/math" xmlns:v="urn:schemas-microsoft-com:vml" xmlns:wp14="http://schemas.microsoft.com/office/word/2010/wordprocessingDrawing" xmlns:wp="http://schemas.openxmlformats.org/drawingml/2006/wordprocessingDrawing" xmlns:w10="urn:schemas-microsoft-com:office:word" xmlns:w="http://schemas.openxmlformats.org/wordprocessingml/2006/main" xmlns:w14="http://schemas.microsoft.com/office/word/2010/wordml" xmlns:w15="http://schemas.microsoft.com/office/word/2012/wordml" xmlns:w16cex="http://schemas.microsoft.com/office/word/2018/wordml/cex" xmlns:w16cid="http://schemas.microsoft.com/office/word/2016/wordml/cid" xmlns:w16="http://schemas.microsoft.com/office/word/2018/wordml" xmlns:w16sdtdh="http://schemas.microsoft.com/office/word/2020/wordml/sdtdatahash" xmlns:w16se="http://schemas.microsoft.com/office/word/2015/wordml/symex" xmlns:wpg="http://schemas.microsoft.com/office/word/2010/wordprocessingGroup" xmlns:wpi="http://schemas.microsoft.com/office/word/2010/wordprocessingInk" xmlns:wne="http://schemas.microsoft.com/office/word/2006/wordml" xmlns:wps="http://schemas.microsoft.com/office/word/2010/wordprocessingShape" mc:Ignorable="w14 w15 w16se w16cid w16 w16cex w16sdtdh wp14">
+<w:footnotes xmlns:wpc="http://schemas.microsoft.com/office/word/2010/wordprocessingCanvas" xmlns:cx="http://schemas.microsoft.com/office/drawing/2014/chartex" xmlns:cx1="http://schemas.microsoft.com/office/drawing/2015/9/8/chartex" xmlns:cx2="http://schemas.microsoft.com/office/drawing/2015/10/21/chartex" xmlns:cx3="http://schemas.microsoft.com/office/drawing/2016/5/9/chartex" xmlns:cx4="http://schemas.microsoft.com/office/drawing/2016/5/10/chartex" xmlns:cx5="http://schemas.microsoft.com/office/drawing/2016/5/11/chartex" xmlns:cx6="http://schemas.microsoft.com/office/drawing/2016/5/12/chartex" xmlns:cx7="http://schemas.microsoft.com/office/drawing/2016/5/13/chartex" xmlns:cx8="http://schemas.microsoft.com/office/drawing/2016/5/14/chartex" xmlns:mc="http://schemas.openxmlformats.org/markup-compatibility/2006" xmlns:aink="http://schemas.microsoft.com/office/drawing/2016/ink" xmlns:am3d="http://schemas.microsoft.com/office/drawing/2017/model3d" xmlns:o="urn:schemas-microsoft-com:office:office" xmlns:oel="http://schemas.microsoft.com/office/2019/extlst" xmlns:r="http://schemas.openxmlformats.org/officeDocument/2006/relationships" xmlns:m="http://schemas.openxmlformats.org/officeDocument/2006/math" xmlns:v="urn:schemas-microsoft-com:vml" xmlns:wp14="http://schemas.microsoft.com/office/word/2010/wordprocessingDrawing" xmlns:wp="http://schemas.openxmlformats.org/drawingml/2006/wordprocessingDrawing" xmlns:w10="urn:schemas-microsoft-com:office:word" xmlns:w="http://schemas.openxmlformats.org/wordprocessingml/2006/main" xmlns:w14="http://schemas.microsoft.com/office/word/2010/wordml" xmlns:w15="http://schemas.microsoft.com/office/word/2012/wordml" xmlns:w16cex="http://schemas.microsoft.com/office/word/2018/wordml/cex" xmlns:w16cid="http://schemas.microsoft.com/office/word/2016/wordml/cid" xmlns:w16="http://schemas.microsoft.com/office/word/2018/wordml" xmlns:w16du="http://schemas.microsoft.com/office/word/2023/wordml/word16du" xmlns:w16sdtdh="http://schemas.microsoft.com/office/word/2020/wordml/sdtdatahash" xmlns:w16sdtfl="http://schemas.microsoft.com/office/word/2024/wordml/sdtformatlock" xmlns:w16se="http://schemas.microsoft.com/office/word/2015/wordml/symex" xmlns:wpg="http://schemas.microsoft.com/office/word/2010/wordprocessingGroup" xmlns:wpi="http://schemas.microsoft.com/office/word/2010/wordprocessingInk" xmlns:wne="http://schemas.microsoft.com/office/word/2006/wordml" xmlns:wps="http://schemas.microsoft.com/office/word/2010/wordprocessingShape" mc:Ignorable="w14 w15 w16se w16cid w16 w16cex w16sdtdh w16sdtfl w16du wp14">
   <w:footnote w:type="separator" w:id="-1">
     <w:p>
       <w:pPr>
@@ -2334,7 +2304,7 @@
 </file>
 
 <file path=word/header1.xml><?xml version="1.0" encoding="utf-8"?>
-<w:hdr xmlns:wpc="http://schemas.microsoft.com/office/word/2010/wordprocessingCanvas" xmlns:cx="http://schemas.microsoft.com/office/drawing/2014/chartex" xmlns:cx1="http://schemas.microsoft.com/office/drawing/2015/9/8/chartex" xmlns:cx2="http://schemas.microsoft.com/office/drawing/2015/10/21/chartex" xmlns:cx3="http://schemas.microsoft.com/office/drawing/2016/5/9/chartex" xmlns:cx4="http://schemas.microsoft.com/office/drawing/2016/5/10/chartex" xmlns:cx5="http://schemas.microsoft.com/office/drawing/2016/5/11/chartex" xmlns:cx6="http://schemas.microsoft.com/office/drawing/2016/5/12/chartex" xmlns:cx7="http://schemas.microsoft.com/office/drawing/2016/5/13/chartex" xmlns:cx8="http://schemas.microsoft.com/office/drawing/2016/5/14/chartex" xmlns:mc="http://schemas.openxmlformats.org/markup-compatibility/2006" xmlns:aink="http://schemas.microsoft.com/office/drawing/2016/ink" xmlns:am3d="http://schemas.microsoft.com/office/drawing/2017/model3d" xmlns:o="urn:schemas-microsoft-com:office:office" xmlns:r="http://schemas.openxmlformats.org/officeDocument/2006/relationships" xmlns:m="http://schemas.openxmlformats.org/officeDocument/2006/math" xmlns:v="urn:schemas-microsoft-com:vml" xmlns:wp14="http://schemas.microsoft.com/office/word/2010/wordprocessingDrawing" xmlns:wp="http://schemas.openxmlformats.org/drawingml/2006/wordprocessingDrawing" xmlns:w10="urn:schemas-microsoft-com:office:word" xmlns:w="http://schemas.openxmlformats.org/wordprocessingml/2006/main" xmlns:w14="http://schemas.microsoft.com/office/word/2010/wordml" xmlns:w15="http://schemas.microsoft.com/office/word/2012/wordml" xmlns:w16cex="http://schemas.microsoft.com/office/word/2018/wordml/cex" xmlns:w16cid="http://schemas.microsoft.com/office/word/2016/wordml/cid" xmlns:w16="http://schemas.microsoft.com/office/word/2018/wordml" xmlns:w16sdtdh="http://schemas.microsoft.com/office/word/2020/wordml/sdtdatahash" xmlns:w16se="http://schemas.microsoft.com/office/word/2015/wordml/symex" xmlns:wpg="http://schemas.microsoft.com/office/word/2010/wordprocessingGroup" xmlns:wpi="http://schemas.microsoft.com/office/word/2010/wordprocessingInk" xmlns:wne="http://schemas.microsoft.com/office/word/2006/wordml" xmlns:wps="http://schemas.microsoft.com/office/word/2010/wordprocessingShape" mc:Ignorable="w14 w15 w16se w16cid w16 w16cex w16sdtdh wp14">
+<w:hdr xmlns:wpc="http://schemas.microsoft.com/office/word/2010/wordprocessingCanvas" xmlns:cx="http://schemas.microsoft.com/office/drawing/2014/chartex" xmlns:cx1="http://schemas.microsoft.com/office/drawing/2015/9/8/chartex" xmlns:cx2="http://schemas.microsoft.com/office/drawing/2015/10/21/chartex" xmlns:cx3="http://schemas.microsoft.com/office/drawing/2016/5/9/chartex" xmlns:cx4="http://schemas.microsoft.com/office/drawing/2016/5/10/chartex" xmlns:cx5="http://schemas.microsoft.com/office/drawing/2016/5/11/chartex" xmlns:cx6="http://schemas.microsoft.com/office/drawing/2016/5/12/chartex" xmlns:cx7="http://schemas.microsoft.com/office/drawing/2016/5/13/chartex" xmlns:cx8="http://schemas.microsoft.com/office/drawing/2016/5/14/chartex" xmlns:mc="http://schemas.openxmlformats.org/markup-compatibility/2006" xmlns:aink="http://schemas.microsoft.com/office/drawing/2016/ink" xmlns:am3d="http://schemas.microsoft.com/office/drawing/2017/model3d" xmlns:o="urn:schemas-microsoft-com:office:office" xmlns:oel="http://schemas.microsoft.com/office/2019/extlst" xmlns:r="http://schemas.openxmlformats.org/officeDocument/2006/relationships" xmlns:m="http://schemas.openxmlformats.org/officeDocument/2006/math" xmlns:v="urn:schemas-microsoft-com:vml" xmlns:wp14="http://schemas.microsoft.com/office/word/2010/wordprocessingDrawing" xmlns:wp="http://schemas.openxmlformats.org/drawingml/2006/wordprocessingDrawing" xmlns:w10="urn:schemas-microsoft-com:office:word" xmlns:w="http://schemas.openxmlformats.org/wordprocessingml/2006/main" xmlns:w14="http://schemas.microsoft.com/office/word/2010/wordml" xmlns:w15="http://schemas.microsoft.com/office/word/2012/wordml" xmlns:w16cex="http://schemas.microsoft.com/office/word/2018/wordml/cex" xmlns:w16cid="http://schemas.microsoft.com/office/word/2016/wordml/cid" xmlns:w16="http://schemas.microsoft.com/office/word/2018/wordml" xmlns:w16du="http://schemas.microsoft.com/office/word/2023/wordml/word16du" xmlns:w16sdtdh="http://schemas.microsoft.com/office/word/2020/wordml/sdtdatahash" xmlns:w16sdtfl="http://schemas.microsoft.com/office/word/2024/wordml/sdtformatlock" xmlns:w16se="http://schemas.microsoft.com/office/word/2015/wordml/symex" xmlns:wpg="http://schemas.microsoft.com/office/word/2010/wordprocessingGroup" xmlns:wpi="http://schemas.microsoft.com/office/word/2010/wordprocessingInk" xmlns:wne="http://schemas.microsoft.com/office/word/2006/wordml" xmlns:wps="http://schemas.microsoft.com/office/word/2010/wordprocessingShape" mc:Ignorable="w14 w15 w16se w16cid w16 w16cex w16sdtdh w16sdtfl w16du wp14">
   <w:p>
     <w:pPr>
       <w:pStyle w:val="Encabezado"/>
@@ -2478,7 +2448,7 @@
 </file>
 
 <file path=word/numbering.xml><?xml version="1.0" encoding="utf-8"?>
-<w:numbering xmlns:wpc="http://schemas.microsoft.com/office/word/2010/wordprocessingCanvas" xmlns:cx="http://schemas.microsoft.com/office/drawing/2014/chartex" xmlns:cx1="http://schemas.microsoft.com/office/drawing/2015/9/8/chartex" xmlns:cx2="http://schemas.microsoft.com/office/drawing/2015/10/21/chartex" xmlns:cx3="http://schemas.microsoft.com/office/drawing/2016/5/9/chartex" xmlns:cx4="http://schemas.microsoft.com/office/drawing/2016/5/10/chartex" xmlns:cx5="http://schemas.microsoft.com/office/drawing/2016/5/11/chartex" xmlns:cx6="http://schemas.microsoft.com/office/drawing/2016/5/12/chartex" xmlns:cx7="http://schemas.microsoft.com/office/drawing/2016/5/13/chartex" xmlns:cx8="http://schemas.microsoft.com/office/drawing/2016/5/14/chartex" xmlns:mc="http://schemas.openxmlformats.org/markup-compatibility/2006" xmlns:aink="http://schemas.microsoft.com/office/drawing/2016/ink" xmlns:am3d="http://schemas.microsoft.com/office/drawing/2017/model3d" xmlns:o="urn:schemas-microsoft-com:office:office" xmlns:r="http://schemas.openxmlformats.org/officeDocument/2006/relationships" xmlns:m="http://schemas.openxmlformats.org/officeDocument/2006/math" xmlns:v="urn:schemas-microsoft-com:vml" xmlns:wp14="http://schemas.microsoft.com/office/word/2010/wordprocessingDrawing" xmlns:wp="http://schemas.openxmlformats.org/drawingml/2006/wordprocessingDrawing" xmlns:w10="urn:schemas-microsoft-com:office:word" xmlns:w="http://schemas.openxmlformats.org/wordprocessingml/2006/main" xmlns:w14="http://schemas.microsoft.com/office/word/2010/wordml" xmlns:w15="http://schemas.microsoft.com/office/word/2012/wordml" xmlns:w16cex="http://schemas.microsoft.com/office/word/2018/wordml/cex" xmlns:w16cid="http://schemas.microsoft.com/office/word/2016/wordml/cid" xmlns:w16="http://schemas.microsoft.com/office/word/2018/wordml" xmlns:w16sdtdh="http://schemas.microsoft.com/office/word/2020/wordml/sdtdatahash" xmlns:w16se="http://schemas.microsoft.com/office/word/2015/wordml/symex" xmlns:wpg="http://schemas.microsoft.com/office/word/2010/wordprocessingGroup" xmlns:wpi="http://schemas.microsoft.com/office/word/2010/wordprocessingInk" xmlns:wne="http://schemas.microsoft.com/office/word/2006/wordml" xmlns:wps="http://schemas.microsoft.com/office/word/2010/wordprocessingShape" mc:Ignorable="w14 w15 w16se w16cid w16 w16cex w16sdtdh wp14">
+<w:numbering xmlns:wpc="http://schemas.microsoft.com/office/word/2010/wordprocessingCanvas" xmlns:cx="http://schemas.microsoft.com/office/drawing/2014/chartex" xmlns:cx1="http://schemas.microsoft.com/office/drawing/2015/9/8/chartex" xmlns:cx2="http://schemas.microsoft.com/office/drawing/2015/10/21/chartex" xmlns:cx3="http://schemas.microsoft.com/office/drawing/2016/5/9/chartex" xmlns:cx4="http://schemas.microsoft.com/office/drawing/2016/5/10/chartex" xmlns:cx5="http://schemas.microsoft.com/office/drawing/2016/5/11/chartex" xmlns:cx6="http://schemas.microsoft.com/office/drawing/2016/5/12/chartex" xmlns:cx7="http://schemas.microsoft.com/office/drawing/2016/5/13/chartex" xmlns:cx8="http://schemas.microsoft.com/office/drawing/2016/5/14/chartex" xmlns:mc="http://schemas.openxmlformats.org/markup-compatibility/2006" xmlns:aink="http://schemas.microsoft.com/office/drawing/2016/ink" xmlns:am3d="http://schemas.microsoft.com/office/drawing/2017/model3d" xmlns:o="urn:schemas-microsoft-com:office:office" xmlns:oel="http://schemas.microsoft.com/office/2019/extlst" xmlns:r="http://schemas.openxmlformats.org/officeDocument/2006/relationships" xmlns:m="http://schemas.openxmlformats.org/officeDocument/2006/math" xmlns:v="urn:schemas-microsoft-com:vml" xmlns:wp14="http://schemas.microsoft.com/office/word/2010/wordprocessingDrawing" xmlns:wp="http://schemas.openxmlformats.org/drawingml/2006/wordprocessingDrawing" xmlns:w10="urn:schemas-microsoft-com:office:word" xmlns:w="http://schemas.openxmlformats.org/wordprocessingml/2006/main" xmlns:w14="http://schemas.microsoft.com/office/word/2010/wordml" xmlns:w15="http://schemas.microsoft.com/office/word/2012/wordml" xmlns:w16cex="http://schemas.microsoft.com/office/word/2018/wordml/cex" xmlns:w16cid="http://schemas.microsoft.com/office/word/2016/wordml/cid" xmlns:w16="http://schemas.microsoft.com/office/word/2018/wordml" xmlns:w16du="http://schemas.microsoft.com/office/word/2023/wordml/word16du" xmlns:w16sdtdh="http://schemas.microsoft.com/office/word/2020/wordml/sdtdatahash" xmlns:w16sdtfl="http://schemas.microsoft.com/office/word/2024/wordml/sdtformatlock" xmlns:w16se="http://schemas.microsoft.com/office/word/2015/wordml/symex" xmlns:wpg="http://schemas.microsoft.com/office/word/2010/wordprocessingGroup" xmlns:wpi="http://schemas.microsoft.com/office/word/2010/wordprocessingInk" xmlns:wne="http://schemas.microsoft.com/office/word/2006/wordml" xmlns:wps="http://schemas.microsoft.com/office/word/2010/wordprocessingShape" mc:Ignorable="w14 w15 w16se w16cid w16 w16cex w16sdtdh w16sdtfl w16du wp14">
   <w:abstractNum w:abstractNumId="0" w15:restartNumberingAfterBreak="0">
     <w:nsid w:val="0B7A0624"/>
     <w:multiLevelType w:val="hybridMultilevel"/>
@@ -2742,6 +2712,155 @@
     </w:lvl>
   </w:abstractNum>
   <w:abstractNum w:abstractNumId="3" w15:restartNumberingAfterBreak="0">
+    <w:nsid w:val="20772580"/>
+    <w:multiLevelType w:val="multilevel"/>
+    <w:tmpl w:val="D6400D72"/>
+    <w:lvl w:ilvl="0">
+      <w:start w:val="1"/>
+      <w:numFmt w:val="bullet"/>
+      <w:lvlText w:val=""/>
+      <w:lvlJc w:val="left"/>
+      <w:pPr>
+        <w:tabs>
+          <w:tab w:val="num" w:pos="720"/>
+        </w:tabs>
+        <w:ind w:left="720" w:hanging="360"/>
+      </w:pPr>
+      <w:rPr>
+        <w:rFonts w:ascii="Symbol" w:hAnsi="Symbol" w:hint="default"/>
+        <w:sz w:val="20"/>
+      </w:rPr>
+    </w:lvl>
+    <w:lvl w:ilvl="1" w:tentative="1">
+      <w:start w:val="1"/>
+      <w:numFmt w:val="bullet"/>
+      <w:lvlText w:val="o"/>
+      <w:lvlJc w:val="left"/>
+      <w:pPr>
+        <w:tabs>
+          <w:tab w:val="num" w:pos="1440"/>
+        </w:tabs>
+        <w:ind w:left="1440" w:hanging="360"/>
+      </w:pPr>
+      <w:rPr>
+        <w:rFonts w:ascii="Courier New" w:hAnsi="Courier New" w:hint="default"/>
+        <w:sz w:val="20"/>
+      </w:rPr>
+    </w:lvl>
+    <w:lvl w:ilvl="2" w:tentative="1">
+      <w:start w:val="1"/>
+      <w:numFmt w:val="bullet"/>
+      <w:lvlText w:val=""/>
+      <w:lvlJc w:val="left"/>
+      <w:pPr>
+        <w:tabs>
+          <w:tab w:val="num" w:pos="2160"/>
+        </w:tabs>
+        <w:ind w:left="2160" w:hanging="360"/>
+      </w:pPr>
+      <w:rPr>
+        <w:rFonts w:ascii="Wingdings" w:hAnsi="Wingdings" w:hint="default"/>
+        <w:sz w:val="20"/>
+      </w:rPr>
+    </w:lvl>
+    <w:lvl w:ilvl="3" w:tentative="1">
+      <w:start w:val="1"/>
+      <w:numFmt w:val="bullet"/>
+      <w:lvlText w:val=""/>
+      <w:lvlJc w:val="left"/>
+      <w:pPr>
+        <w:tabs>
+          <w:tab w:val="num" w:pos="2880"/>
+        </w:tabs>
+        <w:ind w:left="2880" w:hanging="360"/>
+      </w:pPr>
+      <w:rPr>
+        <w:rFonts w:ascii="Wingdings" w:hAnsi="Wingdings" w:hint="default"/>
+        <w:sz w:val="20"/>
+      </w:rPr>
+    </w:lvl>
+    <w:lvl w:ilvl="4" w:tentative="1">
+      <w:start w:val="1"/>
+      <w:numFmt w:val="bullet"/>
+      <w:lvlText w:val=""/>
+      <w:lvlJc w:val="left"/>
+      <w:pPr>
+        <w:tabs>
+          <w:tab w:val="num" w:pos="3600"/>
+        </w:tabs>
+        <w:ind w:left="3600" w:hanging="360"/>
+      </w:pPr>
+      <w:rPr>
+        <w:rFonts w:ascii="Wingdings" w:hAnsi="Wingdings" w:hint="default"/>
+        <w:sz w:val="20"/>
+      </w:rPr>
+    </w:lvl>
+    <w:lvl w:ilvl="5" w:tentative="1">
+      <w:start w:val="1"/>
+      <w:numFmt w:val="bullet"/>
+      <w:lvlText w:val=""/>
+      <w:lvlJc w:val="left"/>
+      <w:pPr>
+        <w:tabs>
+          <w:tab w:val="num" w:pos="4320"/>
+        </w:tabs>
+        <w:ind w:left="4320" w:hanging="360"/>
+      </w:pPr>
+      <w:rPr>
+        <w:rFonts w:ascii="Wingdings" w:hAnsi="Wingdings" w:hint="default"/>
+        <w:sz w:val="20"/>
+      </w:rPr>
+    </w:lvl>
+    <w:lvl w:ilvl="6" w:tentative="1">
+      <w:start w:val="1"/>
+      <w:numFmt w:val="bullet"/>
+      <w:lvlText w:val=""/>
+      <w:lvlJc w:val="left"/>
+      <w:pPr>
+        <w:tabs>
+          <w:tab w:val="num" w:pos="5040"/>
+        </w:tabs>
+        <w:ind w:left="5040" w:hanging="360"/>
+      </w:pPr>
+      <w:rPr>
+        <w:rFonts w:ascii="Wingdings" w:hAnsi="Wingdings" w:hint="default"/>
+        <w:sz w:val="20"/>
+      </w:rPr>
+    </w:lvl>
+    <w:lvl w:ilvl="7" w:tentative="1">
+      <w:start w:val="1"/>
+      <w:numFmt w:val="bullet"/>
+      <w:lvlText w:val=""/>
+      <w:lvlJc w:val="left"/>
+      <w:pPr>
+        <w:tabs>
+          <w:tab w:val="num" w:pos="5760"/>
+        </w:tabs>
+        <w:ind w:left="5760" w:hanging="360"/>
+      </w:pPr>
+      <w:rPr>
+        <w:rFonts w:ascii="Wingdings" w:hAnsi="Wingdings" w:hint="default"/>
+        <w:sz w:val="20"/>
+      </w:rPr>
+    </w:lvl>
+    <w:lvl w:ilvl="8" w:tentative="1">
+      <w:start w:val="1"/>
+      <w:numFmt w:val="bullet"/>
+      <w:lvlText w:val=""/>
+      <w:lvlJc w:val="left"/>
+      <w:pPr>
+        <w:tabs>
+          <w:tab w:val="num" w:pos="6480"/>
+        </w:tabs>
+        <w:ind w:left="6480" w:hanging="360"/>
+      </w:pPr>
+      <w:rPr>
+        <w:rFonts w:ascii="Wingdings" w:hAnsi="Wingdings" w:hint="default"/>
+        <w:sz w:val="20"/>
+      </w:rPr>
+    </w:lvl>
+  </w:abstractNum>
+  <w:abstractNum w:abstractNumId="4" w15:restartNumberingAfterBreak="0">
     <w:nsid w:val="72823870"/>
     <w:multiLevelType w:val="hybridMultilevel"/>
     <w:tmpl w:val="C722F478"/>
@@ -2854,23 +2973,26 @@
       </w:rPr>
     </w:lvl>
   </w:abstractNum>
-  <w:num w:numId="1">
+  <w:num w:numId="1" w16cid:durableId="177624058">
     <w:abstractNumId w:val="2"/>
   </w:num>
-  <w:num w:numId="2">
+  <w:num w:numId="2" w16cid:durableId="1687830095">
     <w:abstractNumId w:val="0"/>
   </w:num>
-  <w:num w:numId="3">
+  <w:num w:numId="3" w16cid:durableId="1476069647">
     <w:abstractNumId w:val="1"/>
   </w:num>
-  <w:num w:numId="4">
+  <w:num w:numId="4" w16cid:durableId="811681837">
+    <w:abstractNumId w:val="4"/>
+  </w:num>
+  <w:num w:numId="5" w16cid:durableId="639304281">
     <w:abstractNumId w:val="3"/>
   </w:num>
 </w:numbering>
 </file>
 
 <file path=word/styles.xml><?xml version="1.0" encoding="utf-8"?>
-<w:styles xmlns:mc="http://schemas.openxmlformats.org/markup-compatibility/2006" xmlns:r="http://schemas.openxmlformats.org/officeDocument/2006/relationships" xmlns:w="http://schemas.openxmlformats.org/wordprocessingml/2006/main" xmlns:w14="http://schemas.microsoft.com/office/word/2010/wordml" xmlns:w15="http://schemas.microsoft.com/office/word/2012/wordml" xmlns:w16cex="http://schemas.microsoft.com/office/word/2018/wordml/cex" xmlns:w16cid="http://schemas.microsoft.com/office/word/2016/wordml/cid" xmlns:w16="http://schemas.microsoft.com/office/word/2018/wordml" xmlns:w16sdtdh="http://schemas.microsoft.com/office/word/2020/wordml/sdtdatahash" xmlns:w16se="http://schemas.microsoft.com/office/word/2015/wordml/symex" mc:Ignorable="w14 w15 w16se w16cid w16 w16cex w16sdtdh">
+<w:styles xmlns:mc="http://schemas.openxmlformats.org/markup-compatibility/2006" xmlns:r="http://schemas.openxmlformats.org/officeDocument/2006/relationships" xmlns:w="http://schemas.openxmlformats.org/wordprocessingml/2006/main" xmlns:w14="http://schemas.microsoft.com/office/word/2010/wordml" xmlns:w15="http://schemas.microsoft.com/office/word/2012/wordml" xmlns:w16cex="http://schemas.microsoft.com/office/word/2018/wordml/cex" xmlns:w16cid="http://schemas.microsoft.com/office/word/2016/wordml/cid" xmlns:w16="http://schemas.microsoft.com/office/word/2018/wordml" xmlns:w16du="http://schemas.microsoft.com/office/word/2023/wordml/word16du" xmlns:w16sdtdh="http://schemas.microsoft.com/office/word/2020/wordml/sdtdatahash" xmlns:w16sdtfl="http://schemas.microsoft.com/office/word/2024/wordml/sdtformatlock" xmlns:w16se="http://schemas.microsoft.com/office/word/2015/wordml/symex" mc:Ignorable="w14 w15 w16se w16cid w16 w16cex w16sdtdh w16sdtfl w16du">
   <w:docDefaults>
     <w:rPrDefault>
       <w:rPr>
@@ -3291,7 +3413,6 @@
   <w:style w:type="character" w:default="1" w:styleId="Fuentedeprrafopredeter">
     <w:name w:val="Default Paragraph Font"/>
     <w:uiPriority w:val="1"/>
-    <w:semiHidden/>
     <w:unhideWhenUsed/>
   </w:style>
   <w:style w:type="table" w:default="1" w:styleId="Tablanormal">

</xml_diff>